<commit_message>
fix(fpj7): confirmar version final ya aplicada manualmente (digitos, celda NUNC, fragmentacion)
</commit_message>
<xml_diff>
--- a/assets/documentos/fpj7-plantilla.docx
+++ b/assets/documentos/fpj7-plantilla.docx
@@ -887,7 +887,6 @@
       <w:tblGrid>
         <w:gridCol w:w="330"/>
         <w:gridCol w:w="331"/>
-        <w:gridCol w:w="333"/>
         <w:gridCol w:w="330"/>
         <w:gridCol w:w="333"/>
         <w:gridCol w:w="333"/>
@@ -948,16 +947,6 @@
         </w:tc>
         <w:tc>
           <w:tcPr>
-            <w:tcW w:w="330" w:type="dxa"/>
-          </w:tcPr>
-          <w:p>
-            <w:pPr>
-              <w:spacing w:line="220" w:lineRule="auto"/>
-            </w:pPr>
-          </w:p>
-        </w:tc>
-        <w:tc>
-          <w:tcPr>
             <w:tcW w:w="333" w:type="dxa"/>
           </w:tcPr>
           <w:p>
@@ -1163,21 +1152,6 @@
               </w:rPr>
               <w:t>DPTO</w:t>
             </w:r>
-          </w:p>
-        </w:tc>
-        <w:tc>
-          <w:tcPr>
-            <w:tcW w:w="333" w:type="dxa"/>
-          </w:tcPr>
-          <w:p>
-            <w:pPr>
-              <w:spacing w:line="220" w:lineRule="auto"/>
-              <w:jc w:val="center"/>
-              <w:rPr>
-                <w:sz w:val="10"/>
-                <w:szCs w:val="10"/>
-              </w:rPr>
-            </w:pPr>
           </w:p>
         </w:tc>
         <w:tc>
@@ -2265,6 +2239,10 @@
                 <w:szCs w:val="13"/>
               </w:rPr>
             </w:pPr>
+            <w:r/>
+          </w:p>
+          <w:p/>
+          <w:p>
             <w:r>
               <w:t>UBICACIÓN:  {{UBICACION_HALLAZGO}}</w:t>
             </w:r>

</xml_diff>